<commit_message>
Faster idle scale-down, rerun autoscaler comparison, showcase README
- autoscaler: with work-aware policy, drop straight to MIN_WORKERS after
  IDLE_SCALE_DOWN_S (10 s) with no queued work; new unit test (43 tests)
- rerun HPA / KEDA / work-aware comparison (3 runs each); work-aware now
  uses 25 % fewer pod-seconds than KEDA (was 9 %), 100 % within target;
  old runs kept in benchmark/results/autoscale_before_idle_fix/
- report, slides and guide rebuilt with the new numbers and screenshots
- README rewritten as a project showcase; run steps moved to docs/HOW_TO_RUN.md
- remove superseded v1 report, guide, screenshots, logs and scripts

Co-Authored-By: Claude Opus 5.5 <noreply@anthropic.com>
</commit_message>
<xml_diff>
--- a/docs/How_to_Run_Guide.docx
+++ b/docs/How_to_Run_Guide.docx
@@ -1069,7 +1069,7 @@
               <w:rPr>
                 <w:sz w:val="18"/>
               </w:rPr>
-              <w:t>pytest suite (42 tests)</w:t>
+              <w:t>pytest suite (43 tests)</w:t>
             </w:r>
           </w:p>
         </w:tc>
@@ -1935,7 +1935,7 @@
           <w:rFonts w:ascii="Consolas" w:hAnsi="Consolas" w:eastAsia="Consolas"/>
           <w:sz w:val="15"/>
         </w:rPr>
-        <w:t>.venv/bin/python -m pytest -q                # 42 passed</w:t>
+        <w:t>.venv/bin/python -m pytest -q                # 43 passed</w:t>
       </w:r>
     </w:p>
     <w:p>
@@ -1995,7 +1995,7 @@
         <w:rPr>
           <w:sz w:val="18"/>
         </w:rPr>
-        <w:t xml:space="preserve"> The test suite: 42 tests, including S3 mode, neural tiling, planner and work accounting.</w:t>
+        <w:t xml:space="preserve"> The test suite: 43 tests, including S3 mode, neural tiling, planner and work accounting.</w:t>
       </w:r>
     </w:p>
     <w:p>
@@ -5148,7 +5148,7 @@
                 <w:rFonts w:ascii="Consolas" w:hAnsi="Consolas" w:eastAsia="Consolas"/>
                 <w:sz w:val="16"/>
               </w:rPr>
-              <w:t>python scripts/capture_v2.py --k8s</w:t>
+              <w:t>python scripts/capture_screenshots.py --k8s</w:t>
             </w:r>
           </w:p>
         </w:tc>
@@ -7253,6 +7253,60 @@
           </w:p>
         </w:tc>
       </w:tr>
+      <w:tr>
+        <w:tc>
+          <w:tcPr>
+            <w:tcW w:type="dxa" w:w="3402"/>
+          </w:tcPr>
+          <w:p>
+            <w:pPr>
+              <w:jc w:val="left"/>
+            </w:pPr>
+            <w:r/>
+            <w:r>
+              <w:rPr>
+                <w:rFonts w:ascii="Consolas" w:hAnsi="Consolas" w:eastAsia="Consolas"/>
+                <w:sz w:val="16"/>
+              </w:rPr>
+              <w:t>IDLE_SCALE_DOWN_S</w:t>
+            </w:r>
+          </w:p>
+        </w:tc>
+        <w:tc>
+          <w:tcPr>
+            <w:tcW w:type="dxa" w:w="1928"/>
+          </w:tcPr>
+          <w:p>
+            <w:pPr>
+              <w:jc w:val="left"/>
+            </w:pPr>
+            <w:r/>
+            <w:r>
+              <w:rPr>
+                <w:sz w:val="18"/>
+              </w:rPr>
+              <w:t>10</w:t>
+            </w:r>
+          </w:p>
+        </w:tc>
+        <w:tc>
+          <w:tcPr>
+            <w:tcW w:type="dxa" w:w="4025"/>
+          </w:tcPr>
+          <w:p>
+            <w:pPr>
+              <w:jc w:val="left"/>
+            </w:pPr>
+            <w:r/>
+            <w:r>
+              <w:rPr>
+                <w:sz w:val="18"/>
+              </w:rPr>
+              <w:t>work mode: once nothing is queued or running for this long, drop to MIN_WORKERS</w:t>
+            </w:r>
+          </w:p>
+        </w:tc>
+      </w:tr>
     </w:tbl>
     <w:p>
       <w:pPr>

</xml_diff>